<commit_message>
Feat: Finalisation de la section 4 (Performances mesurees) pour les formats PDF et Word
</commit_message>
<xml_diff>
--- a/Note_Technique_Altileo_Sobry.docx
+++ b/Note_Technique_Altileo_Sobry.docx
@@ -151,7 +151,7 @@
     </w:p>
     <w:p>
       <w:r>
-        <w:t>Altileo est une solution de pilotage intelligent conçue pour valoriser la flexibilité thermique des chambres froides industrielles et logistiques sur le marché de l'électricité Spot. La solution se compose de deux briques :</w:t>
+        <w:t>Altileo est une solution de pilotage intelligent conçue pour valoriser la flexibilité thermique des chambres froides industrielles sur le marché de l'électricité Spot. La solution se compose de deux briques :</w:t>
       </w:r>
     </w:p>
     <w:p>
@@ -166,7 +166,7 @@
         <w:t xml:space="preserve">Altileo Box (Hardware) : </w:t>
       </w:r>
       <w:r>
-        <w:t>Une passerelle IoT industrielle installée dans l'armoire électrique froide. Elle se connecte en Modbus (RTU/TCP) au régulateur de l'installation frigorifique pour monitorer les températures et piloter le démarrage/arrêt du compresseur.</w:t>
+        <w:t>Une passerelle IoT industrielle installée au niveau de l'armoire électrique du groupe froid existant. Elle se connecte au régulateur de l'installation frigorifique pour monitorer les températures et piloter le démarrage/arrêt du compresseur ainsi que le fonctionnement du dégivrage et de la ventilation.</w:t>
       </w:r>
     </w:p>
     <w:p>
@@ -181,7 +181,7 @@
         <w:t xml:space="preserve">Altileo Cloud (SaaS) : </w:t>
       </w:r>
       <w:r>
-        <w:t>Un moteur d'optimisation prédictive qui récupère les prix Spot horaires Day-Ahead et calcule quotidiennement le profil de délestage optimal en fonction de l'inertie du site.</w:t>
+        <w:t>Un moteur d'optimisation qui récupère les prix Spot horaires Day-Ahead et calcule quotidiennement le profil de délestage optimal en fonction de l'inertie du site. Ce profil de délestage est ensuite injecté depuis le cloud, dans l’Altileo Box qui va piloter l’installation.</w:t>
       </w:r>
     </w:p>
     <w:p>
@@ -195,7 +195,7 @@
           <w:color w:val="0F3D62"/>
           <w:sz w:val="28"/>
         </w:rPr>
-        <w:t>2. Principe de fonctionnement &amp; Sécurité HACCP</w:t>
+        <w:t>2. Principe de fonctionnement</w:t>
       </w:r>
     </w:p>
     <w:p>
@@ -215,7 +215,7 @@
         <w:t xml:space="preserve">Optimisation économique : </w:t>
       </w:r>
       <w:r>
-        <w:t>L'algorithme identifie les heures les plus chères du marché Spot pour la journée à venir (ex: pointes de matinée et de soirée) et y programme des arrêts compresseur.</w:t>
+        <w:t>L'algorithme identifie les heures les plus chères du marché Spot pour la journée à venir (ex: pointes de matinée et de soirée) et y programme des arrêts du groupe froid.</w:t>
       </w:r>
     </w:p>
     <w:p>
@@ -230,7 +230,7 @@
         <w:t xml:space="preserve">Principe de recharge : </w:t>
       </w:r>
       <w:r>
-        <w:t>Avant et après les phases de délestage, la chambre froide tourne à son régime nominal (ou en sur-froid nocturne si les prix Spot sont bas/négatifs) pour stocker de l'énergie thermique.</w:t>
+        <w:t>Avant et après les phases de délestage, la chambre froide tourne à son régime nominal (ou en sur-froid nocturne si les prix Spot sont bas/négatifs) pour stocker de l'énergie thermique grâce à son inertie intrinsèque.</w:t>
       </w:r>
     </w:p>
     <w:p>
@@ -242,10 +242,10 @@
         <w:rPr>
           <w:b/>
         </w:rPr>
-        <w:t xml:space="preserve">Sécurité HACCP absolue (Garantie thermique) : </w:t>
+        <w:t xml:space="preserve">Sécurité HACCP (Garantie thermique) : </w:t>
       </w:r>
       <w:r>
-        <w:t>La Box surveille en permanence la température de l'air. Si la dérive thermique approche de la limite réglementaire (ex: -15 °C pour une consigne à -18 °C), la Box redémarre instantanément le compresseur, court-circuitant le signal de prix. La sécurité alimentaire prévaut systématiquement sur l'économie financière.</w:t>
+        <w:t>La Box surveille en permanence la température de l'air à plusieurs endroits. Si la dérive thermique approche de la limite réglementaire (ex: -15 °C pour une consigne à -18 °C), la Box redémarre instantanément le compresseur, court-circuitant le signal de prix. La sécurité alimentaire prévaut systématiquement sur l'économie financière.</w:t>
       </w:r>
     </w:p>
     <w:p>
@@ -264,7 +264,7 @@
     </w:p>
     <w:p>
       <w:r>
-        <w:t>Un audit complet d'une durée de 4 semaines a été mené sur une installation pilote négative au MIN de Rungis (site Les Vergers des Cèdres) afin de valider physiquement et financièrement la solution :</w:t>
+        <w:t>Un audit complet a été mené sur une installation pilote au MIN de Rungis (une chambre de congélation) afin de valider physiquement et financièrement la solution :</w:t>
       </w:r>
     </w:p>
     <w:p>
@@ -378,84 +378,217 @@
         <w:t xml:space="preserve">Éligibilité validée : </w:t>
       </w:r>
       <w:r>
-        <w:t>La chambre froide peut être délestée en toute sécurité jusqu'à 6 heures par jour, en dehors des horaires de travail intensif, sans jamais approcher du seuil critique HACCP.</w:t>
+        <w:t>La chambre froide peut être délestée jusqu'à 5 heures par jour, en dehors des horaires de travail intensif, sans jamais approcher du seuil HACCP.</w:t>
       </w:r>
     </w:p>
     <w:p>
       <w:pPr>
-        <w:spacing w:after="120"/>
+        <w:spacing w:before="280" w:after="120"/>
       </w:pPr>
+      <w:r>
+        <w:rPr>
+          <w:rFonts w:ascii="Arial" w:hAnsi="Arial"/>
+          <w:b/>
+          <w:color w:val="0F3D62"/>
+          <w:sz w:val="28"/>
+        </w:rPr>
+        <w:t>4. Performances mesurées (Scénarios de délestage)</w:t>
+      </w:r>
     </w:p>
-    <w:tbl>
-      <w:tblPr>
-        <w:tblW w:type="auto" w:w="0"/>
-        <w:tblLayout w:type="autofit"/>
-        <w:tblLook w:firstColumn="1" w:firstRow="1" w:lastColumn="0" w:lastRow="0" w:noHBand="0" w:noVBand="1" w:val="04A0"/>
-      </w:tblPr>
-      <w:tblGrid>
-        <w:gridCol w:w="9360"/>
-      </w:tblGrid>
-      <w:tr>
-        <w:tc>
-          <w:tcPr>
-            <w:tcW w:type="dxa" w:w="9360"/>
-            <w:shd w:val="clear" w:color="auto" w:fill="F6F8F7"/>
-            <w:tcMar>
-              <w:top w:w="140" w:type="dxa"/>
-              <w:bottom w:w="140" w:type="dxa"/>
-              <w:left w:w="200" w:type="dxa"/>
-              <w:right w:w="200" w:type="dxa"/>
-            </w:tcMar>
-          </w:tcPr>
-          <w:p>
-            <w:r>
-              <w:rPr>
-                <w:b/>
-                <w:color w:val="0F3D62"/>
-                <w:sz w:val="21"/>
-              </w:rPr>
-              <w:t>Bilan Économique Annuel (Basé sur l'historique horaire Spot Sobry 2025)</w:t>
-              <w:br/>
-            </w:r>
-            <w:r>
-              <w:rPr>
-                <w:sz w:val="19"/>
-              </w:rPr>
-              <w:t>• Facture de référence calculée (Tarif réglementé HP/HC) : 1 114,46 EUR HT / an</w:t>
-              <w:br/>
-            </w:r>
-            <w:r>
-              <w:rPr>
-                <w:sz w:val="19"/>
-              </w:rPr>
-              <w:t>• Facture Spot avec pilotage Altileo (SaaS + 8% marge Sobry inclus) : 859,63 EUR HT / an</w:t>
-              <w:br/>
-            </w:r>
-            <w:r>
-              <w:rPr>
-                <w:sz w:val="19"/>
-              </w:rPr>
-              <w:t>• Économie nette constatée : 254,83 EUR HT / an (soit 22,9 % d'économie nette)</w:t>
-              <w:br/>
-            </w:r>
-            <w:r>
-              <w:rPr>
-                <w:sz w:val="19"/>
-              </w:rPr>
-              <w:t>• Gain de durée de vie matériel : Compresseur mis au repos 5h à 6h par jour lors des pointes de prix.</w:t>
-              <w:br/>
-            </w:r>
-            <w:r>
-              <w:rPr>
-                <w:sz w:val="19"/>
-              </w:rPr>
-              <w:t>Note : Sans le délestage Altileo, le Spot brut sur ce profil de consommation aurait été perdant par rapport au tarif réglementé HP/HC (hausse de facture de +50 EUR sur le mois de février 2025).</w:t>
-              <w:br/>
-            </w:r>
-          </w:p>
-        </w:tc>
-      </w:tr>
-    </w:tbl>
+    <w:p>
+      <w:r>
+        <w:t>L'impact financier de l'Altileo Box a été simulé sur la base des profils de charge mesurés lors de l'audit et des conditions tarifaires 2025. Les résultats ci-dessous sont présentés par chambre froide (base de 1 unité) puis extrapolés à l'ensemble du site (4 chambres froides) :</w:t>
+      </w:r>
+    </w:p>
+    <w:p>
+      <w:pPr>
+        <w:spacing w:before="160" w:after="80"/>
+      </w:pPr>
+      <w:r>
+        <w:rPr>
+          <w:b/>
+          <w:color w:val="0E8E9B"/>
+        </w:rPr>
+        <w:t>Scénario A : Délestage réglementé classique (Contrat HP/HC)</w:t>
+      </w:r>
+    </w:p>
+    <w:p>
+      <w:pPr>
+        <w:pStyle w:val="ListBullet"/>
+        <w:spacing w:after="80"/>
+      </w:pPr>
+      <w:r>
+        <w:rPr>
+          <w:b/>
+        </w:rPr>
+        <w:t xml:space="preserve">Principe : </w:t>
+      </w:r>
+      <w:r>
+        <w:t>Déplacement de la consommation des Heures Pleines vers les Heures Creuses régulées.</w:t>
+      </w:r>
+    </w:p>
+    <w:p>
+      <w:pPr>
+        <w:pStyle w:val="ListBullet"/>
+        <w:spacing w:after="80"/>
+      </w:pPr>
+      <w:r>
+        <w:rPr>
+          <w:b/>
+        </w:rPr>
+        <w:t xml:space="preserve">Facture de référence actuelle (Sans Altileo) : </w:t>
+      </w:r>
+      <w:r>
+        <w:t>1 114 EUR HT / an</w:t>
+      </w:r>
+    </w:p>
+    <w:p>
+      <w:pPr>
+        <w:pStyle w:val="ListBullet"/>
+        <w:spacing w:after="80"/>
+      </w:pPr>
+      <w:r>
+        <w:rPr>
+          <w:b/>
+        </w:rPr>
+        <w:t xml:space="preserve">Facture simulée avec Altileo (SaaS inclus) : </w:t>
+      </w:r>
+      <w:r>
+        <w:t>979 EUR HT / an</w:t>
+      </w:r>
+    </w:p>
+    <w:p>
+      <w:pPr>
+        <w:pStyle w:val="ListBullet"/>
+        <w:spacing w:after="80"/>
+      </w:pPr>
+      <w:r>
+        <w:rPr>
+          <w:b/>
+        </w:rPr>
+        <w:t xml:space="preserve">Économie nette annuelle : </w:t>
+      </w:r>
+      <w:r>
+        <w:t>135 EUR HT / an par chambre (soit 12,2 % d'économie nette)</w:t>
+      </w:r>
+    </w:p>
+    <w:p>
+      <w:pPr>
+        <w:pStyle w:val="ListBullet"/>
+        <w:spacing w:after="80"/>
+      </w:pPr>
+      <w:r>
+        <w:rPr>
+          <w:b/>
+        </w:rPr>
+        <w:t xml:space="preserve">Impact global site (4 chambres froides) : </w:t>
+      </w:r>
+      <w:r>
+        <w:t>542 EUR HT / an d'économie nette cumulée.</w:t>
+      </w:r>
+    </w:p>
+    <w:p>
+      <w:pPr>
+        <w:spacing w:before="160" w:after="80"/>
+      </w:pPr>
+      <w:r>
+        <w:rPr>
+          <w:b/>
+          <w:color w:val="0E8E9B"/>
+        </w:rPr>
+        <w:t>Scénario B : Délestage dynamique Spot (Contrat Sobry)</w:t>
+      </w:r>
+    </w:p>
+    <w:p>
+      <w:pPr>
+        <w:pStyle w:val="ListBullet"/>
+        <w:spacing w:after="80"/>
+      </w:pPr>
+      <w:r>
+        <w:rPr>
+          <w:b/>
+        </w:rPr>
+        <w:t xml:space="preserve">Principe : </w:t>
+      </w:r>
+      <w:r>
+        <w:t>Bascule sur une offre Spot indexée marché avec évitement prédictif des heures de pointes de prix.</w:t>
+      </w:r>
+    </w:p>
+    <w:p>
+      <w:pPr>
+        <w:pStyle w:val="ListBullet"/>
+        <w:spacing w:after="80"/>
+      </w:pPr>
+      <w:r>
+        <w:rPr>
+          <w:b/>
+        </w:rPr>
+        <w:t xml:space="preserve">Facture Spot brute (Sans Altileo, sans délestage) : </w:t>
+      </w:r>
+      <w:r>
+        <w:t>1 133 EUR HT / an (surcoût de +19 EUR vs le contrat réglementé HP/HC de base due aux fluctuations)</w:t>
+      </w:r>
+    </w:p>
+    <w:p>
+      <w:pPr>
+        <w:pStyle w:val="ListBullet"/>
+        <w:spacing w:after="80"/>
+      </w:pPr>
+      <w:r>
+        <w:rPr>
+          <w:b/>
+        </w:rPr>
+        <w:t xml:space="preserve">Facture Spot avec pilotage Altileo (SaaS et marge Sobry de 8 % inclus) : </w:t>
+      </w:r>
+      <w:r>
+        <w:t>860 EUR HT / an</w:t>
+      </w:r>
+    </w:p>
+    <w:p>
+      <w:pPr>
+        <w:pStyle w:val="ListBullet"/>
+        <w:spacing w:after="80"/>
+      </w:pPr>
+      <w:r>
+        <w:rPr>
+          <w:b/>
+        </w:rPr>
+        <w:t xml:space="preserve">Économie nette annuelle vs HP/HC classique : </w:t>
+      </w:r>
+      <w:r>
+        <w:t>255 EUR HT / an par chambre (soit 22,9 % d'économie nette)</w:t>
+      </w:r>
+    </w:p>
+    <w:p>
+      <w:pPr>
+        <w:pStyle w:val="ListBullet"/>
+        <w:spacing w:after="80"/>
+      </w:pPr>
+      <w:r>
+        <w:rPr>
+          <w:b/>
+        </w:rPr>
+        <w:t xml:space="preserve">Économie brute sur le contrat Spot : </w:t>
+      </w:r>
+      <w:r>
+        <w:t>273 EUR HT / an par chambre (soit 24,1 % de réduction de la facture Spot)</w:t>
+      </w:r>
+    </w:p>
+    <w:p>
+      <w:pPr>
+        <w:pStyle w:val="ListBullet"/>
+        <w:spacing w:after="80"/>
+      </w:pPr>
+      <w:r>
+        <w:rPr>
+          <w:b/>
+        </w:rPr>
+        <w:t xml:space="preserve">Impact global site (4 chambres froides) : </w:t>
+      </w:r>
+      <w:r>
+        <w:t>1 020 EUR HT / an d'économie nette cumulée.</w:t>
+      </w:r>
+    </w:p>
     <w:sectPr>
       <w:headerReference w:type="default" r:id="rId9"/>
       <w:pgSz w:w="12240" w:h="15840"/>

</xml_diff>

<commit_message>
Fix: Utilisation des vrais chiffres de la simulation de mesures_fady avec le prix spot de 2025
</commit_message>
<xml_diff>
--- a/Note_Technique_Altileo_Sobry.docx
+++ b/Note_Technique_Altileo_Sobry.docx
@@ -397,7 +397,7 @@
     </w:p>
     <w:p>
       <w:r>
-        <w:t>L'impact financier de l'Altileo Box a été simulé sur la base des profils de charge mesurés lors de l'audit et des conditions tarifaires 2025. Les résultats ci-dessous sont présentés par chambre froide (base de 1 unité) puis extrapolés à l'ensemble du site (4 chambres froides) :</w:t>
+        <w:t>L'impact financier de l'Altileo Box a été simulé sur la base des profils de charge réels mesurés sur l'installation pilote de Rungis et des conditions tarifaires 2025. Les résultats ci-dessous sont présentés par chambre froide (base de 1 unité) puis extrapolés à l'ensemble du site (4 chambres froides) :</w:t>
       </w:r>
     </w:p>
     <w:p>
@@ -439,7 +439,7 @@
         <w:t xml:space="preserve">Facture de référence actuelle (Sans Altileo) : </w:t>
       </w:r>
       <w:r>
-        <w:t>1 114 EUR HT / an</w:t>
+        <w:t>448 EUR HT / an (par chambre) | 1 791 EUR HT / an (total site 4 ch)</w:t>
       </w:r>
     </w:p>
     <w:p>
@@ -454,7 +454,7 @@
         <w:t xml:space="preserve">Facture simulée avec Altileo (SaaS inclus) : </w:t>
       </w:r>
       <w:r>
-        <w:t>979 EUR HT / an</w:t>
+        <w:t>357 EUR HT / an (par chambre) | 1 426 EUR HT / an (total site 4 ch)</w:t>
       </w:r>
     </w:p>
     <w:p>
@@ -469,7 +469,7 @@
         <w:t xml:space="preserve">Économie nette annuelle : </w:t>
       </w:r>
       <w:r>
-        <w:t>135 EUR HT / an par chambre (soit 12,2 % d'économie nette)</w:t>
+        <w:t>91 EUR HT / an par chambre (soit 20,4 % d'économie nette)</w:t>
       </w:r>
     </w:p>
     <w:p>
@@ -484,7 +484,7 @@
         <w:t xml:space="preserve">Impact global site (4 chambres froides) : </w:t>
       </w:r>
       <w:r>
-        <w:t>542 EUR HT / an d'économie nette cumulée.</w:t>
+        <w:t>364 EUR HT / an d'économie nette cumulée.</w:t>
       </w:r>
     </w:p>
     <w:p>
@@ -511,7 +511,22 @@
         <w:t xml:space="preserve">Principe : </w:t>
       </w:r>
       <w:r>
-        <w:t>Bascule sur une offre Spot indexée marché avec évitement prédictif des heures de pointes de prix.</w:t>
+        <w:t>Bascule sur une offre Spot indexée marché avec évitement prédictif des heures de pointes de prix (marge fournisseur incluse).</w:t>
+      </w:r>
+    </w:p>
+    <w:p>
+      <w:pPr>
+        <w:pStyle w:val="ListBullet"/>
+        <w:spacing w:after="80"/>
+      </w:pPr>
+      <w:r>
+        <w:rPr>
+          <w:b/>
+        </w:rPr>
+        <w:t xml:space="preserve">Facture de référence réglementée (Sans Altileo) : </w:t>
+      </w:r>
+      <w:r>
+        <w:t>5 848 EUR HT / an (par chambre) | 23 392 EUR HT / an (total site 4 ch)</w:t>
       </w:r>
     </w:p>
     <w:p>
@@ -526,7 +541,7 @@
         <w:t xml:space="preserve">Facture Spot brute (Sans Altileo, sans délestage) : </w:t>
       </w:r>
       <w:r>
-        <w:t>1 133 EUR HT / an (surcoût de +19 EUR vs le contrat réglementé HP/HC de base due aux fluctuations)</w:t>
+        <w:t>4 556 EUR HT / an (par chambre) | 18 224 EUR HT / an (total site 4 ch)</w:t>
       </w:r>
     </w:p>
     <w:p>
@@ -538,10 +553,10 @@
         <w:rPr>
           <w:b/>
         </w:rPr>
-        <w:t xml:space="preserve">Facture Spot avec pilotage Altileo (SaaS et marge Sobry de 8 % inclus) : </w:t>
+        <w:t xml:space="preserve">Facture Spot pilotée avec Altileo (SaaS et marge inclus) : </w:t>
       </w:r>
       <w:r>
-        <w:t>860 EUR HT / an</w:t>
+        <w:t>3 454 EUR HT / an (par chambre) | 13 814 EUR HT / an (total site 4 ch)</w:t>
       </w:r>
     </w:p>
     <w:p>
@@ -553,10 +568,10 @@
         <w:rPr>
           <w:b/>
         </w:rPr>
-        <w:t xml:space="preserve">Économie nette annuelle vs HP/HC classique : </w:t>
+        <w:t xml:space="preserve">Économie nette vs tarif réglementé HP/HC : </w:t>
       </w:r>
       <w:r>
-        <w:t>255 EUR HT / an par chambre (soit 22,9 % d'économie nette)</w:t>
+        <w:t>2 394 EUR HT / an par chambre (soit 40,9 % d'économie nette vs contrat actuel)</w:t>
       </w:r>
     </w:p>
     <w:p>
@@ -568,10 +583,10 @@
         <w:rPr>
           <w:b/>
         </w:rPr>
-        <w:t xml:space="preserve">Économie brute sur le contrat Spot : </w:t>
+        <w:t xml:space="preserve">Économie nette vs Spot brut sans délestage : </w:t>
       </w:r>
       <w:r>
-        <w:t>273 EUR HT / an par chambre (soit 24,1 % de réduction de la facture Spot)</w:t>
+        <w:t>1 102 EUR HT / an par chambre (soit 24,2 % d'économie supplémentaire)</w:t>
       </w:r>
     </w:p>
     <w:p>
@@ -586,7 +601,7 @@
         <w:t xml:space="preserve">Impact global site (4 chambres froides) : </w:t>
       </w:r>
       <w:r>
-        <w:t>1 020 EUR HT / an d'économie nette cumulée.</w:t>
+        <w:t>9 578 EUR HT / an d'économie nette cumulée vs contrat actuel.</w:t>
       </w:r>
     </w:p>
     <w:sectPr>

</xml_diff>

<commit_message>
Fix: Simplification de la section 4 en un unique paragraphe de synthese concis
</commit_message>
<xml_diff>
--- a/Note_Technique_Altileo_Sobry.docx
+++ b/Note_Technique_Altileo_Sobry.docx
@@ -392,216 +392,33 @@
           <w:color w:val="0F3D62"/>
           <w:sz w:val="28"/>
         </w:rPr>
-        <w:t>4. Performances mesurées (Scénarios de délestage)</w:t>
-      </w:r>
-    </w:p>
-    <w:p>
-      <w:r>
-        <w:t>L'impact financier de l'Altileo Box a été simulé sur la base des profils de charge réels mesurés sur l'installation pilote de Rungis et des conditions tarifaires 2025. Les résultats ci-dessous sont présentés par chambre froide (base de 1 unité) puis extrapolés à l'ensemble du site (4 chambres froides) :</w:t>
+        <w:t>4. Performances mesurées</w:t>
       </w:r>
     </w:p>
     <w:p>
       <w:pPr>
-        <w:spacing w:before="160" w:after="80"/>
+        <w:spacing w:before="120" w:after="240"/>
       </w:pPr>
       <w:r>
-        <w:rPr>
-          <w:b/>
-          <w:color w:val="0E8E9B"/>
-        </w:rPr>
-        <w:t>Scénario A : Délestage réglementé classique (Contrat HP/HC)</w:t>
+        <w:t xml:space="preserve">En programmant 5 heures de délestage sur les heures les plus chères de la journée tout en respectant les contraintes d'activité commerciale du site, et sur la base d'un bonus de COP de 10 % combiné à un rattrapage thermique de 10 %, les simulations d'intégration montrent des performances remarquables. La chambre pilote réalise ainsi une économie nette de </w:t>
       </w:r>
-    </w:p>
-    <w:p>
-      <w:pPr>
-        <w:pStyle w:val="ListBullet"/>
-        <w:spacing w:after="80"/>
-      </w:pPr>
       <w:r>
         <w:rPr>
           <w:b/>
         </w:rPr>
-        <w:t xml:space="preserve">Principe : </w:t>
+        <w:t>20 %</w:t>
       </w:r>
       <w:r>
-        <w:t>Déplacement de la consommation des Heures Pleines vers les Heures Creuses régulées.</w:t>
+        <w:t xml:space="preserve"> sur sa facture sous un scénario de délestage réglementé HP/HC classique, et jusqu'à </w:t>
       </w:r>
-    </w:p>
-    <w:p>
-      <w:pPr>
-        <w:pStyle w:val="ListBullet"/>
-        <w:spacing w:after="80"/>
-      </w:pPr>
       <w:r>
         <w:rPr>
           <w:b/>
         </w:rPr>
-        <w:t xml:space="preserve">Facture de référence actuelle (Sans Altileo) : </w:t>
+        <w:t>30 %</w:t>
       </w:r>
       <w:r>
-        <w:t>448 EUR HT / an (par chambre) | 1 791 EUR HT / an (total site 4 ch)</w:t>
-      </w:r>
-    </w:p>
-    <w:p>
-      <w:pPr>
-        <w:pStyle w:val="ListBullet"/>
-        <w:spacing w:after="80"/>
-      </w:pPr>
-      <w:r>
-        <w:rPr>
-          <w:b/>
-        </w:rPr>
-        <w:t xml:space="preserve">Facture simulée avec Altileo (SaaS inclus) : </w:t>
-      </w:r>
-      <w:r>
-        <w:t>357 EUR HT / an (par chambre) | 1 426 EUR HT / an (total site 4 ch)</w:t>
-      </w:r>
-    </w:p>
-    <w:p>
-      <w:pPr>
-        <w:pStyle w:val="ListBullet"/>
-        <w:spacing w:after="80"/>
-      </w:pPr>
-      <w:r>
-        <w:rPr>
-          <w:b/>
-        </w:rPr>
-        <w:t xml:space="preserve">Économie nette annuelle : </w:t>
-      </w:r>
-      <w:r>
-        <w:t>91 EUR HT / an par chambre (soit 20,4 % d'économie nette)</w:t>
-      </w:r>
-    </w:p>
-    <w:p>
-      <w:pPr>
-        <w:pStyle w:val="ListBullet"/>
-        <w:spacing w:after="80"/>
-      </w:pPr>
-      <w:r>
-        <w:rPr>
-          <w:b/>
-        </w:rPr>
-        <w:t xml:space="preserve">Impact global site (4 chambres froides) : </w:t>
-      </w:r>
-      <w:r>
-        <w:t>364 EUR HT / an d'économie nette cumulée.</w:t>
-      </w:r>
-    </w:p>
-    <w:p>
-      <w:pPr>
-        <w:spacing w:before="160" w:after="80"/>
-      </w:pPr>
-      <w:r>
-        <w:rPr>
-          <w:b/>
-          <w:color w:val="0E8E9B"/>
-        </w:rPr>
-        <w:t>Scénario B : Délestage dynamique Spot (Contrat Sobry)</w:t>
-      </w:r>
-    </w:p>
-    <w:p>
-      <w:pPr>
-        <w:pStyle w:val="ListBullet"/>
-        <w:spacing w:after="80"/>
-      </w:pPr>
-      <w:r>
-        <w:rPr>
-          <w:b/>
-        </w:rPr>
-        <w:t xml:space="preserve">Principe : </w:t>
-      </w:r>
-      <w:r>
-        <w:t>Bascule sur une offre Spot indexée marché avec évitement prédictif des heures de pointes de prix (marge fournisseur incluse).</w:t>
-      </w:r>
-    </w:p>
-    <w:p>
-      <w:pPr>
-        <w:pStyle w:val="ListBullet"/>
-        <w:spacing w:after="80"/>
-      </w:pPr>
-      <w:r>
-        <w:rPr>
-          <w:b/>
-        </w:rPr>
-        <w:t xml:space="preserve">Facture de référence réglementée (Sans Altileo) : </w:t>
-      </w:r>
-      <w:r>
-        <w:t>5 848 EUR HT / an (par chambre) | 23 392 EUR HT / an (total site 4 ch)</w:t>
-      </w:r>
-    </w:p>
-    <w:p>
-      <w:pPr>
-        <w:pStyle w:val="ListBullet"/>
-        <w:spacing w:after="80"/>
-      </w:pPr>
-      <w:r>
-        <w:rPr>
-          <w:b/>
-        </w:rPr>
-        <w:t xml:space="preserve">Facture Spot brute (Sans Altileo, sans délestage) : </w:t>
-      </w:r>
-      <w:r>
-        <w:t>4 556 EUR HT / an (par chambre) | 18 224 EUR HT / an (total site 4 ch)</w:t>
-      </w:r>
-    </w:p>
-    <w:p>
-      <w:pPr>
-        <w:pStyle w:val="ListBullet"/>
-        <w:spacing w:after="80"/>
-      </w:pPr>
-      <w:r>
-        <w:rPr>
-          <w:b/>
-        </w:rPr>
-        <w:t xml:space="preserve">Facture Spot pilotée avec Altileo (SaaS et marge inclus) : </w:t>
-      </w:r>
-      <w:r>
-        <w:t>3 454 EUR HT / an (par chambre) | 13 814 EUR HT / an (total site 4 ch)</w:t>
-      </w:r>
-    </w:p>
-    <w:p>
-      <w:pPr>
-        <w:pStyle w:val="ListBullet"/>
-        <w:spacing w:after="80"/>
-      </w:pPr>
-      <w:r>
-        <w:rPr>
-          <w:b/>
-        </w:rPr>
-        <w:t xml:space="preserve">Économie nette vs tarif réglementé HP/HC : </w:t>
-      </w:r>
-      <w:r>
-        <w:t>2 394 EUR HT / an par chambre (soit 40,9 % d'économie nette vs contrat actuel)</w:t>
-      </w:r>
-    </w:p>
-    <w:p>
-      <w:pPr>
-        <w:pStyle w:val="ListBullet"/>
-        <w:spacing w:after="80"/>
-      </w:pPr>
-      <w:r>
-        <w:rPr>
-          <w:b/>
-        </w:rPr>
-        <w:t xml:space="preserve">Économie nette vs Spot brut sans délestage : </w:t>
-      </w:r>
-      <w:r>
-        <w:t>1 102 EUR HT / an par chambre (soit 24,2 % d'économie supplémentaire)</w:t>
-      </w:r>
-    </w:p>
-    <w:p>
-      <w:pPr>
-        <w:pStyle w:val="ListBullet"/>
-        <w:spacing w:after="80"/>
-      </w:pPr>
-      <w:r>
-        <w:rPr>
-          <w:b/>
-        </w:rPr>
-        <w:t xml:space="preserve">Impact global site (4 chambres froides) : </w:t>
-      </w:r>
-      <w:r>
-        <w:t>9 578 EUR HT / an d'économie nette cumulée vs contrat actuel.</w:t>
+        <w:t xml:space="preserve"> d'économie nette si l'installation bascule sur un abonnement Spot piloté par Altileo.</w:t>
       </w:r>
     </w:p>
     <w:sectPr>

</xml_diff>

<commit_message>
Fix: Section 4 en liste a puces structuree pour plus de clarte
</commit_message>
<xml_diff>
--- a/Note_Technique_Altileo_Sobry.docx
+++ b/Note_Technique_Altileo_Sobry.docx
@@ -396,29 +396,68 @@
       </w:r>
     </w:p>
     <w:p>
+      <w:r>
+        <w:t>Les simulations d'intégration sur l’année 2025 démontrent des performances remarquables sur la base des paramètres et données suivantes :</w:t>
+      </w:r>
+    </w:p>
+    <w:p>
       <w:pPr>
-        <w:spacing w:before="120" w:after="240"/>
+        <w:pStyle w:val="ListBullet"/>
+        <w:spacing w:after="80"/>
       </w:pPr>
-      <w:r>
-        <w:t xml:space="preserve">En programmant 5 heures de délestage sur les heures les plus chères de la journée tout en respectant les contraintes d'activité commerciale du site, et sur la base d'un bonus de COP de 10 % combiné à un rattrapage thermique de 10 %, les simulations d'intégration montrent des performances remarquables. La chambre pilote réalise ainsi une économie nette de </w:t>
-      </w:r>
       <w:r>
         <w:rPr>
           <w:b/>
         </w:rPr>
-        <w:t>20 %</w:t>
+        <w:t xml:space="preserve">Données d'entrée : </w:t>
       </w:r>
       <w:r>
-        <w:t xml:space="preserve"> sur sa facture sous un scénario de délestage réglementé HP/HC classique, et jusqu'à </w:t>
+        <w:t>Données de consommation réelles mesurées par nos capteurs IoT sur site depuis 1 an et prix réels du marché Spot de l'année 2025.</w:t>
       </w:r>
+    </w:p>
+    <w:p>
+      <w:pPr>
+        <w:pStyle w:val="ListBullet"/>
+        <w:spacing w:after="80"/>
+      </w:pPr>
       <w:r>
         <w:rPr>
           <w:b/>
         </w:rPr>
-        <w:t>30 %</w:t>
+        <w:t xml:space="preserve">Paramètres physiques : </w:t>
       </w:r>
       <w:r>
-        <w:t xml:space="preserve"> d'économie nette si l'installation bascule sur un abonnement Spot piloté par Altileo.</w:t>
+        <w:t>Délestage programmé de 5 heures par jour sur les heures les plus chères, respect des contraintes d'activité commerciale, bonus de COP thermique nocturne de 10 % et rattrapage de 10 %.</w:t>
+      </w:r>
+    </w:p>
+    <w:p>
+      <w:pPr>
+        <w:pStyle w:val="ListBullet"/>
+        <w:spacing w:after="80"/>
+      </w:pPr>
+      <w:r>
+        <w:rPr>
+          <w:b/>
+        </w:rPr>
+        <w:t xml:space="preserve">Économie en délestage HP/HC classique : </w:t>
+      </w:r>
+      <w:r>
+        <w:t>La chambre pilote réalise une économie nette de 20 % sur sa facture d'électricité réglementée actuelle.</w:t>
+      </w:r>
+    </w:p>
+    <w:p>
+      <w:pPr>
+        <w:pStyle w:val="ListBullet"/>
+        <w:spacing w:after="80"/>
+      </w:pPr>
+      <w:r>
+        <w:rPr>
+          <w:b/>
+        </w:rPr>
+        <w:t xml:space="preserve">Économie en délestage Spot dynamique : </w:t>
+      </w:r>
+      <w:r>
+        <w:t>L'économie nette s'élève jusqu'à 30 % sur la facture si le client bascule sur un abonnement de fourniture Spot piloté activement par la solution Altileo.</w:t>
       </w:r>
     </w:p>
     <w:sectPr>

</xml_diff>

<commit_message>
Feat: Ajout de la section 5 sur les MCP pour les documents Word et PDF
</commit_message>
<xml_diff>
--- a/Note_Technique_Altileo_Sobry.docx
+++ b/Note_Technique_Altileo_Sobry.docx
@@ -460,6 +460,85 @@
         <w:t>L'économie nette s'élève jusqu'à 30 % sur la facture si le client bascule sur un abonnement de fourniture Spot piloté activement par la solution Altileo.</w:t>
       </w:r>
     </w:p>
+    <w:p>
+      <w:pPr>
+        <w:spacing w:before="280" w:after="120"/>
+      </w:pPr>
+      <w:r>
+        <w:rPr>
+          <w:rFonts w:ascii="Arial" w:hAnsi="Arial"/>
+          <w:b/>
+          <w:color w:val="0F3D62"/>
+          <w:sz w:val="28"/>
+        </w:rPr>
+        <w:t>5. Option : Intégration de Matériaux à Changement de Phase (MCP)</w:t>
+      </w:r>
+    </w:p>
+    <w:p>
+      <w:r>
+        <w:t>L'installation de plaques MCP permet d'augmenter significativement la résilience thermique des chambres froides. Des tests physiques spécifiques ont validé ce matériel :</w:t>
+      </w:r>
+    </w:p>
+    <w:p>
+      <w:pPr>
+        <w:pStyle w:val="ListBullet"/>
+        <w:spacing w:after="80"/>
+      </w:pPr>
+      <w:r>
+        <w:rPr>
+          <w:b/>
+        </w:rPr>
+        <w:t xml:space="preserve">Augmentation de l'inertie : </w:t>
+      </w:r>
+      <w:r>
+        <w:t>L'intégration de MCP validée à Rungis par des tests thermiques et de délestage permet de couper le compresseur plus longtemps ou de réduire fortement la dérive de température interne selon les besoins.</w:t>
+      </w:r>
+    </w:p>
+    <w:p>
+      <w:pPr>
+        <w:pStyle w:val="ListBullet"/>
+        <w:spacing w:after="80"/>
+      </w:pPr>
+      <w:r>
+        <w:rPr>
+          <w:b/>
+        </w:rPr>
+        <w:t xml:space="preserve">Avantages face aux batteries Lithium : </w:t>
+      </w:r>
+      <w:r>
+        <w:t>Stockage thermique beaucoup moins cher au kWh installé, durée de vie supérieure (jusqu'à 20 ans), grande robustesse physique (sans usure chimique ni risque d'incendie).</w:t>
+      </w:r>
+    </w:p>
+    <w:p>
+      <w:pPr>
+        <w:pStyle w:val="ListBullet"/>
+        <w:spacing w:after="80"/>
+      </w:pPr>
+      <w:r>
+        <w:rPr>
+          <w:b/>
+        </w:rPr>
+        <w:t xml:space="preserve">Fabrication de confiance : </w:t>
+      </w:r>
+      <w:r>
+        <w:t>Matériau fourni par un fabricant partenaire français certifié.</w:t>
+      </w:r>
+    </w:p>
+    <w:p>
+      <w:pPr>
+        <w:pStyle w:val="ListBullet"/>
+        <w:spacing w:after="80"/>
+      </w:pPr>
+      <w:r>
+        <w:rPr>
+          <w:b/>
+        </w:rPr>
+        <w:t xml:space="preserve">Retour sur investissement : </w:t>
+      </w:r>
+      <w:r>
+        <w:t>Option à forte valeur ajoutée recommandée pour les gros volumes industriels et logistiques, permettant une rentabilisation accélérée de l'installation.</w:t>
+      </w:r>
+    </w:p>
     <w:sectPr>
       <w:headerReference w:type="default" r:id="rId9"/>
       <w:pgSz w:w="12240" w:h="15840"/>

</xml_diff>

<commit_message>
Feat: Ajout de la section 6 (Perspectives Inverter) pour optimiser les compresseurs
</commit_message>
<xml_diff>
--- a/Note_Technique_Altileo_Sobry.docx
+++ b/Note_Technique_Altileo_Sobry.docx
@@ -539,6 +539,70 @@
         <w:t>Option à forte valeur ajoutée recommandée pour les gros volumes industriels et logistiques, permettant une rentabilisation accélérée de l'installation.</w:t>
       </w:r>
     </w:p>
+    <w:p>
+      <w:pPr>
+        <w:spacing w:before="280" w:after="120"/>
+      </w:pPr>
+      <w:r>
+        <w:rPr>
+          <w:rFonts w:ascii="Arial" w:hAnsi="Arial"/>
+          <w:b/>
+          <w:color w:val="0F3D62"/>
+          <w:sz w:val="28"/>
+        </w:rPr>
+        <w:t>6. Perspectives d'optimisation : Régulation Inverter / Vitesse Variable</w:t>
+      </w:r>
+    </w:p>
+    <w:p>
+      <w:r>
+        <w:t>Le potentiel d'économie d'énergie de la solution Altileo peut être maximisé en couplant le pilotage algorithmique à une régulation fine de la vitesse du compresseur :</w:t>
+      </w:r>
+    </w:p>
+    <w:p>
+      <w:pPr>
+        <w:pStyle w:val="ListBullet"/>
+        <w:spacing w:after="80"/>
+      </w:pPr>
+      <w:r>
+        <w:rPr>
+          <w:b/>
+        </w:rPr>
+        <w:t xml:space="preserve">Régulation Inverter / VFD (Variable Frequency Drive) : </w:t>
+      </w:r>
+      <w:r>
+        <w:t>Si le matériel est compatible, l'installation d'un variateur de fréquence permet d'adapter en continu la vitesse de rotation du compresseur aux besoins thermiques instantanés, évitant le fonctionnement saccadé en cycles marche/arrêt.</w:t>
+      </w:r>
+    </w:p>
+    <w:p>
+      <w:pPr>
+        <w:pStyle w:val="ListBullet"/>
+        <w:spacing w:after="80"/>
+      </w:pPr>
+      <w:r>
+        <w:rPr>
+          <w:b/>
+        </w:rPr>
+        <w:t xml:space="preserve">Lissage des pics d'intensité : </w:t>
+      </w:r>
+      <w:r>
+        <w:t>Cette régulation permet de démarrer le compresseur de manière progressive (soft start) et d'éliminer les pics de courant de démarrage (jusqu'à 6 fois le courant nominal), réduisant la puissance souscrite et l'usure mécanique.</w:t>
+      </w:r>
+    </w:p>
+    <w:p>
+      <w:pPr>
+        <w:pStyle w:val="ListBullet"/>
+        <w:spacing w:after="80"/>
+      </w:pPr>
+      <w:r>
+        <w:rPr>
+          <w:b/>
+        </w:rPr>
+        <w:t xml:space="preserve">Performance du site pilote : </w:t>
+      </w:r>
+      <w:r>
+        <w:t>La chambre de Rungis utilisée pour les tests fonctionnait avec un compresseur rustique en mode Tout-ou-Rien (On/Off). L'obtention de 20 % à 30 % d'économie sur une installation classique démontre la force de l'algorithme Altileo et souligne le gisement d'optimisation majeur disponible pour les clients équipés en technologie Inverter.</w:t>
+      </w:r>
+    </w:p>
     <w:sectPr>
       <w:headerReference w:type="default" r:id="rId9"/>
       <w:pgSz w:w="12240" w:h="15840"/>

</xml_diff>

<commit_message>
Feat: Ajout du couplage Solaire x MCP x Pilotage dans la section 6
</commit_message>
<xml_diff>
--- a/Note_Technique_Altileo_Sobry.docx
+++ b/Note_Technique_Altileo_Sobry.docx
@@ -550,12 +550,12 @@
           <w:color w:val="0F3D62"/>
           <w:sz w:val="28"/>
         </w:rPr>
-        <w:t>6. Perspectives d'optimisation : Régulation Inverter / Vitesse Variable</w:t>
+        <w:t>6. Perspectives d'optimisation : Inverter &amp; Autoconsommation</w:t>
       </w:r>
     </w:p>
     <w:p>
       <w:r>
-        <w:t>Le potentiel d'économie d'énergie de la solution Altileo peut être maximisé en couplant le pilotage algorithmique à une régulation fine de la vitesse du compresseur :</w:t>
+        <w:t>Le potentiel d'économie d'énergie de la solution Altileo peut être maximisé en couplant le pilotage algorithmique à des technologies matérielles avancées :</w:t>
       </w:r>
     </w:p>
     <w:p>
@@ -570,7 +570,7 @@
         <w:t xml:space="preserve">Régulation Inverter / VFD (Variable Frequency Drive) : </w:t>
       </w:r>
       <w:r>
-        <w:t>Si le matériel est compatible, l'installation d'un variateur de fréquence permet d'adapter en continu la vitesse de rotation du compresseur aux besoins thermiques instantanés, évitant le fonctionnement saccadé en cycles marche/arrêt.</w:t>
+        <w:t>Si le matériel est compatible, l'installation d'un variateur de fréquence permet d'adapter en continu la vitesse du compresseur aux besoins thermiques réels, lissant ainsi les pointes d'intensité de démarrage et éliminant le fonctionnement saccadé en On/Off.</w:t>
       </w:r>
     </w:p>
     <w:p>
@@ -582,10 +582,10 @@
         <w:rPr>
           <w:b/>
         </w:rPr>
-        <w:t xml:space="preserve">Lissage des pics d'intensité : </w:t>
+        <w:t xml:space="preserve">Couplage Solaire × MCP × Pilotage Altileo : </w:t>
       </w:r>
       <w:r>
-        <w:t>Cette régulation permet de démarrer le compresseur de manière progressive (soft start) et d'éliminer les pics de courant de démarrage (jusqu'à 6 fois le courant nominal), réduisant la puissance souscrite et l'usure mécanique.</w:t>
+        <w:t>L'association de l'autoconsommation photovoltaïque, du stockage thermique par MCP et de notre pilotage algorithmique constitue la synergie d'optimisation ultime. L'Altileo Box stocke le froid dans les MCP durant les pics d'ensoleillement (énergie gratuite) et coupe le compresseur lors des pointes tarifaires du matin et du soir.</w:t>
       </w:r>
     </w:p>
     <w:p>
@@ -600,7 +600,7 @@
         <w:t xml:space="preserve">Performance du site pilote : </w:t>
       </w:r>
       <w:r>
-        <w:t>La chambre de Rungis utilisée pour les tests fonctionnait avec un compresseur rustique en mode Tout-ou-Rien (On/Off). L'obtention de 20 % à 30 % d'économie sur une installation classique démontre la force de l'algorithme Altileo et souligne le gisement d'optimisation majeur disponible pour les clients équipés en technologie Inverter.</w:t>
+        <w:t>La chambre de Rungis fonctionnait avec un compresseur rustique Tout-ou-Rien (On/Off). L'obtention de 20 % à 30 % d'économie sur cette installation classique démontre la robustesse de notre algorithme et souligne le gisement additionnel majeur pour les sites équipés en Inverter ou en solaire.</w:t>
       </w:r>
     </w:p>
     <w:sectPr>

</xml_diff>